<commit_message>
fix(nd30-forms): ẩn thông tin nhạy cảm trong ví dụ biên bản làm việc
- Tên 6 cá nhân bên A/B -> [Họ tên ...]
- Số hợp đồng 2709/PVP.TM - S5T/2021/HHDV, ngày ký, ngày họp, hạn 31/3/2023 -> chỗ trống
- Tên các bên (PVPower, S5T), khách hàng PV Power -> [Tên Bên A/B], [Khách hàng]
- Tỷ lệ giữ lại 40% giá trị hợp đồng -> ...
- Xóa tác giả metadata (dc:creator, cp:lastModifiedBy)
</commit_message>
<xml_diff>
--- a/skills/nd30-forms/examples/docx-Bien-ban-lam-viec-mau.docx
+++ b/skills/nd30-forms/examples/docx-Bien-ban-lam-viec-mau.docx
@@ -167,7 +167,7 @@
           <w:sz w:val="27"/>
           <w:szCs w:val="27"/>
         </w:rPr>
-        <w:t>13</w:t>
+        <w:t>... tháng ... năm ....</w:t>
       </w:r>
       <w:r>
         <w:rPr>
@@ -176,7 +176,7 @@
           <w:sz w:val="27"/>
           <w:szCs w:val="27"/>
         </w:rPr>
-        <w:t xml:space="preserve"> tháng </w:t>
+        <w:t/>
       </w:r>
       <w:r>
         <w:rPr>
@@ -185,7 +185,7 @@
           <w:sz w:val="27"/>
           <w:szCs w:val="27"/>
         </w:rPr>
-        <w:t>01</w:t>
+        <w:t/>
       </w:r>
       <w:r>
         <w:rPr>
@@ -194,7 +194,7 @@
           <w:sz w:val="27"/>
           <w:szCs w:val="27"/>
         </w:rPr>
-        <w:t xml:space="preserve"> năm 202</w:t>
+        <w:t/>
       </w:r>
       <w:r>
         <w:rPr>
@@ -203,7 +203,7 @@
           <w:sz w:val="27"/>
           <w:szCs w:val="27"/>
         </w:rPr>
-        <w:t>3</w:t>
+        <w:t/>
       </w:r>
     </w:p>
     <w:p>
@@ -292,7 +292,7 @@
           <w:sz w:val="28"/>
           <w:lang w:val="vi-VN"/>
         </w:rPr>
-        <w:t>u trữ, phân tích dữ liệu và hiển thị trực tuyến thông tin vận hành các nhà máy điện PV Power (Power Monitoring)</w:t>
+        <w:t>u trữ, phân tích dữ liệu và hiển thị trực tuyến thông tin vận hành các nhà máy điện [Khách hàng] (Power Monitoring)</w:t>
       </w:r>
     </w:p>
     <w:p>
@@ -338,7 +338,7 @@
           <w:sz w:val="26"/>
           <w:szCs w:val="26"/>
         </w:rPr>
-        <w:t>Căn cứ Hợp đồng số 2709/PVP.TM - S5T/2021/HHDV ngày 27/09/2021: Trang bị hệ thống thu thập, lưu trữ, phân tích dữ liệu và hiển thị trực tuyến thông tin vận hành các nhà máy điện PV Power (Power Monitoring) giữa Tổng Công ty Điện lực Dầu khí Việt Nam - CTCP và Công ty CP Công nghệ và Giải pháp S5T Việt Nam (Sau đây gọi là Hợp đồng)</w:t>
+        <w:t>Căn cứ Hợp đồng số ....../........../.......... ngày ..../..../........: Trang bị hệ thống thu thập, lưu trữ, phân tích dữ liệu và hiển thị trực tuyến thông tin vận hành các nhà máy điện [Khách hàng] (Power Monitoring) giữa Tổng công ty [Tên Bên A] - CTCP và Công ty CP [Tên Bên B] (Sau đây gọi là Hợp đồng)</w:t>
       </w:r>
       <w:r>
         <w:rPr>
@@ -387,70 +387,70 @@
           <w:sz w:val="26"/>
           <w:szCs w:val="26"/>
         </w:rPr>
-        <w:t>13</w:t>
-      </w:r>
-      <w:r>
-        <w:rPr>
-          <w:rFonts w:ascii="Times New Roman" w:hAnsi="Times New Roman"/>
-          <w:iCs/>
-          <w:sz w:val="26"/>
-          <w:szCs w:val="26"/>
-        </w:rPr>
-        <w:t>/</w:t>
-      </w:r>
-      <w:r>
-        <w:rPr>
-          <w:rFonts w:ascii="Times New Roman" w:hAnsi="Times New Roman"/>
-          <w:iCs/>
-          <w:sz w:val="26"/>
-          <w:szCs w:val="26"/>
-        </w:rPr>
-        <w:t>01</w:t>
-      </w:r>
-      <w:r>
-        <w:rPr>
-          <w:rFonts w:ascii="Times New Roman" w:hAnsi="Times New Roman"/>
-          <w:iCs/>
-          <w:sz w:val="26"/>
-          <w:szCs w:val="26"/>
-        </w:rPr>
-        <w:t>/202</w:t>
-      </w:r>
-      <w:r>
-        <w:rPr>
-          <w:rFonts w:ascii="Times New Roman" w:hAnsi="Times New Roman"/>
-          <w:iCs/>
-          <w:sz w:val="26"/>
-          <w:szCs w:val="26"/>
-        </w:rPr>
-        <w:t>3</w:t>
-      </w:r>
-      <w:r>
-        <w:rPr>
-          <w:rFonts w:ascii="Times New Roman" w:hAnsi="Times New Roman"/>
-          <w:iCs/>
-          <w:sz w:val="26"/>
-          <w:szCs w:val="26"/>
-        </w:rPr>
-        <w:t xml:space="preserve">, đại diện Tổng công ty Điện lực Dầu khí Việt Nam </w:t>
-      </w:r>
-      <w:r>
-        <w:rPr>
-          <w:rFonts w:ascii="Times New Roman" w:hAnsi="Times New Roman"/>
-          <w:iCs/>
-          <w:sz w:val="26"/>
-          <w:szCs w:val="26"/>
-        </w:rPr>
-        <w:t xml:space="preserve">- CTCP và </w:t>
-      </w:r>
-      <w:r>
-        <w:rPr>
-          <w:rFonts w:ascii="Times New Roman" w:hAnsi="Times New Roman"/>
-          <w:iCs/>
-          <w:sz w:val="26"/>
-          <w:szCs w:val="26"/>
-        </w:rPr>
-        <w:t xml:space="preserve">Công ty Cổ phần Công nghệ và Giải pháp S5T Việt Nam </w:t>
+        <w:t>.../.../....</w:t>
+      </w:r>
+      <w:r>
+        <w:rPr>
+          <w:rFonts w:ascii="Times New Roman" w:hAnsi="Times New Roman"/>
+          <w:iCs/>
+          <w:sz w:val="26"/>
+          <w:szCs w:val="26"/>
+        </w:rPr>
+        <w:t/>
+      </w:r>
+      <w:r>
+        <w:rPr>
+          <w:rFonts w:ascii="Times New Roman" w:hAnsi="Times New Roman"/>
+          <w:iCs/>
+          <w:sz w:val="26"/>
+          <w:szCs w:val="26"/>
+        </w:rPr>
+        <w:t/>
+      </w:r>
+      <w:r>
+        <w:rPr>
+          <w:rFonts w:ascii="Times New Roman" w:hAnsi="Times New Roman"/>
+          <w:iCs/>
+          <w:sz w:val="26"/>
+          <w:szCs w:val="26"/>
+        </w:rPr>
+        <w:t/>
+      </w:r>
+      <w:r>
+        <w:rPr>
+          <w:rFonts w:ascii="Times New Roman" w:hAnsi="Times New Roman"/>
+          <w:iCs/>
+          <w:sz w:val="26"/>
+          <w:szCs w:val="26"/>
+        </w:rPr>
+        <w:t/>
+      </w:r>
+      <w:r>
+        <w:rPr>
+          <w:rFonts w:ascii="Times New Roman" w:hAnsi="Times New Roman"/>
+          <w:iCs/>
+          <w:sz w:val="26"/>
+          <w:szCs w:val="26"/>
+        </w:rPr>
+        <w:t xml:space="preserve">, đại diện Tổng công ty [Tên Bên A] - CTCP</w:t>
+      </w:r>
+      <w:r>
+        <w:rPr>
+          <w:rFonts w:ascii="Times New Roman" w:hAnsi="Times New Roman"/>
+          <w:iCs/>
+          <w:sz w:val="26"/>
+          <w:szCs w:val="26"/>
+        </w:rPr>
+        <w:t xml:space="preserve"> và </w:t>
+      </w:r>
+      <w:r>
+        <w:rPr>
+          <w:rFonts w:ascii="Times New Roman" w:hAnsi="Times New Roman"/>
+          <w:iCs/>
+          <w:sz w:val="26"/>
+          <w:szCs w:val="26"/>
+        </w:rPr>
+        <w:t xml:space="preserve">Công ty CP [Tên Bên B] </w:t>
       </w:r>
       <w:r>
         <w:rPr>
@@ -477,7 +477,7 @@
           <w:sz w:val="26"/>
           <w:szCs w:val="26"/>
         </w:rPr>
-        <w:t>gói thầu: Trang bị hệ thống thu thập, lưu trữ, phân tích dữ liệu và hiển thị trực tuyến thông tin vận hành các nhà máy điện PV Power (Power Monitoring)</w:t>
+        <w:t>gói thầu: Trang bị hệ thống thu thập, lưu trữ, phân tích dữ liệu và hiển thị trực tuyến thông tin vận hành các nhà máy điện [Khách hàng] (Power Monitoring)</w:t>
       </w:r>
       <w:r>
         <w:rPr>
@@ -540,7 +540,7 @@
           <w:sz w:val="26"/>
           <w:szCs w:val="26"/>
         </w:rPr>
-        <w:t>I- Tổng công ty Điện lực Dầu khí Việt Nam - CTCP (</w:t>
+        <w:t>I- Tổng công ty [Tên Bên A] - CTCP (</w:t>
       </w:r>
       <w:r>
         <w:rPr>
@@ -592,7 +592,7 @@
           <w:sz w:val="26"/>
           <w:szCs w:val="26"/>
         </w:rPr>
-        <w:t>Ông Mai Quang Vinh</w:t>
+        <w:t>Ông [Họ tên A1]</w:t>
       </w:r>
       <w:r>
         <w:rPr>
@@ -666,7 +666,7 @@
           <w:sz w:val="26"/>
           <w:szCs w:val="26"/>
         </w:rPr>
-        <w:t>Ông Nguyễn Bá Quân</w:t>
+        <w:t>Ông [Họ tên A2]</w:t>
       </w:r>
       <w:r>
         <w:rPr>
@@ -732,7 +732,7 @@
           <w:sz w:val="26"/>
           <w:szCs w:val="26"/>
         </w:rPr>
-        <w:t>Ông Hoàng Long</w:t>
+        <w:t>Ông [Họ tên A3]</w:t>
       </w:r>
       <w:r>
         <w:rPr>
@@ -799,7 +799,7 @@
           <w:sz w:val="26"/>
           <w:szCs w:val="26"/>
         </w:rPr>
-        <w:t>Ông Nguyễn Huy Thanh</w:t>
+        <w:t>Ông [Họ tên A4]</w:t>
       </w:r>
       <w:r>
         <w:rPr>
@@ -856,7 +856,7 @@
           <w:sz w:val="26"/>
           <w:szCs w:val="26"/>
         </w:rPr>
-        <w:t xml:space="preserve">Công ty Cổ phần Công nghệ và Giải pháp S5T Việt Nam </w:t>
+        <w:t xml:space="preserve">Công ty CP [Tên Bên B] </w:t>
       </w:r>
       <w:r>
         <w:rPr>
@@ -903,7 +903,7 @@
           <w:sz w:val="26"/>
           <w:szCs w:val="26"/>
         </w:rPr>
-        <w:t>Dương Đăng Bách</w:t>
+        <w:t>[Họ tên B1]</w:t>
       </w:r>
       <w:r>
         <w:rPr>
@@ -958,7 +958,7 @@
           <w:sz w:val="26"/>
           <w:szCs w:val="26"/>
         </w:rPr>
-        <w:t xml:space="preserve"> Ông Trần Thế Vũ</w:t>
+        <w:t xml:space="preserve"> Ông [Họ tên B2]</w:t>
       </w:r>
       <w:r>
         <w:rPr>
@@ -1329,7 +1329,7 @@
           <w:sz w:val="26"/>
           <w:szCs w:val="26"/>
         </w:rPr>
-        <w:t xml:space="preserve"> (40% giá trị hợp đồng?)</w:t>
+        <w:t xml:space="preserve"> (...% giá trị hợp đồng)</w:t>
       </w:r>
       <w:r>
         <w:rPr>
@@ -1401,7 +1401,7 @@
           <w:sz w:val="26"/>
           <w:szCs w:val="26"/>
         </w:rPr>
-        <w:t xml:space="preserve">Trước ngày 31/3/2023, Bên B có trách nhiệm cung cấp đầy đủ chứng nhận của hãng sản xuất đối với </w:t>
+        <w:t xml:space="preserve">Trước ngày .../.../...., Bên B có trách nhiệm cung cấp đầy đủ chứng nhận của hãng sản xuất đối với </w:t>
       </w:r>
       <w:r>
         <w:rPr>
@@ -1626,7 +1626,7 @@
                 <w:sz w:val="27"/>
                 <w:szCs w:val="27"/>
               </w:rPr>
-              <w:t>Mai Quang Vinh</w:t>
+              <w:t>[Họ tên A1]</w:t>
             </w:r>
           </w:p>
         </w:tc>
@@ -1714,7 +1714,7 @@
                 <w:sz w:val="27"/>
                 <w:szCs w:val="27"/>
               </w:rPr>
-              <w:t>Dương Đăng Bách</w:t>
+              <w:t>[Họ tên B1]</w:t>
             </w:r>
           </w:p>
         </w:tc>

</xml_diff>